<commit_message>
Final PIA guide PDF locked and deployed
</commit_message>
<xml_diff>
--- a/public/assets/prosper_in_america_guia_pt.docx
+++ b/public/assets/prosper_in_america_guia_pt.docx
@@ -4,106 +4,42 @@
   <w:body>
     <w:p>
       <w:pPr>
-        <w:spacing w:before="1600" w:after="160"/>
+        <w:spacing w:before="0" w:after="0"/>
         <w:jc w:val="center"/>
-        <w:shd w:val="clear" w:color="auto" w:fill="0F1B2D"/>
-      </w:pPr>
-      <w:r>
-        <w:rPr>
-          <w:rFonts w:ascii="Montserrat" w:hAnsi="Montserrat"/>
-          <w:b/>
-          <w:i w:val="0"/>
-          <w:color w:val="C8952E"/>
-          <w:sz w:val="64"/>
-        </w:rPr>
-        <w:t>PROSPER IN AMERICA</w:t>
-      </w:r>
-    </w:p>
-    <w:p>
-      <w:pPr>
-        <w:spacing w:before="0" w:after="120"/>
-        <w:jc w:val="center"/>
-        <w:shd w:val="clear" w:color="auto" w:fill="0F1B2D"/>
-      </w:pPr>
-      <w:r>
-        <w:rPr>
-          <w:rFonts w:ascii="Inter" w:hAnsi="Inter"/>
-          <w:b w:val="0"/>
-          <w:i w:val="0"/>
-          <w:color w:val="F6F1E9"/>
-          <w:sz w:val="32"/>
-        </w:rPr>
-        <w:t>O Guia Financeiro Inicial do Imigrante</w:t>
-      </w:r>
-    </w:p>
-    <w:p>
-      <w:pPr>
-        <w:spacing w:before="80" w:after="80"/>
-        <w:jc w:val="center"/>
-        <w:shd w:val="clear" w:color="auto" w:fill="0F1B2D"/>
-      </w:pPr>
-      <w:r>
-        <w:rPr>
-          <w:rFonts w:ascii="Inter" w:hAnsi="Inter"/>
-          <w:b w:val="0"/>
-          <w:i/>
-          <w:color w:val="F6F1E9"/>
-          <w:sz w:val="26"/>
-        </w:rPr>
-        <w:t>7 Passos Para Construir Sua Vida nos Estados Unidos</w:t>
-      </w:r>
-    </w:p>
-    <w:p>
-      <w:pPr>
-        <w:spacing w:before="0" w:after="0"/>
-        <w:shd w:val="clear" w:color="auto" w:fill="0F1B2D"/>
-      </w:pPr>
-    </w:p>
-    <w:p>
-      <w:pPr>
-        <w:spacing w:before="0" w:after="0"/>
-        <w:shd w:val="clear" w:color="auto" w:fill="0F1B2D"/>
-      </w:pPr>
-    </w:p>
-    <w:p>
-      <w:pPr>
-        <w:spacing w:before="0" w:after="0"/>
-        <w:shd w:val="clear" w:color="auto" w:fill="0F1B2D"/>
-      </w:pPr>
-    </w:p>
-    <w:p>
-      <w:pPr>
-        <w:spacing w:before="0" w:after="0"/>
-        <w:shd w:val="clear" w:color="auto" w:fill="0F1B2D"/>
-      </w:pPr>
-    </w:p>
-    <w:p>
-      <w:pPr>
-        <w:spacing w:before="0" w:after="0"/>
-        <w:shd w:val="clear" w:color="auto" w:fill="0F1B2D"/>
-      </w:pPr>
-    </w:p>
-    <w:p>
-      <w:pPr>
-        <w:spacing w:before="0" w:after="0"/>
-        <w:shd w:val="clear" w:color="auto" w:fill="0F1B2D"/>
-      </w:pPr>
-    </w:p>
-    <w:p>
-      <w:pPr>
-        <w:spacing w:before="0" w:after="1600"/>
-        <w:jc w:val="center"/>
-        <w:shd w:val="clear" w:color="auto" w:fill="0F1B2D"/>
-      </w:pPr>
-      <w:r>
-        <w:rPr>
-          <w:rFonts w:ascii="Inter" w:hAnsi="Inter"/>
-          <w:b w:val="0"/>
-          <w:i w:val="0"/>
-          <w:color w:val="5B6E8A"/>
-          <w:sz w:val="20"/>
-        </w:rPr>
-        <w:t>prosperinamerica.com</w:t>
+      </w:pPr>
+      <w:r>
+        <w:drawing>
+          <wp:inline xmlns:a="http://schemas.openxmlformats.org/drawingml/2006/main" xmlns:pic="http://schemas.openxmlformats.org/drawingml/2006/picture">
+            <wp:extent cx="5760720" cy="8641080"/>
+            <wp:docPr id="1" name="Picture 1"/>
+            <wp:cNvGraphicFramePr>
+              <a:graphicFrameLocks noChangeAspect="1"/>
+            </wp:cNvGraphicFramePr>
+            <a:graphic>
+              <a:graphicData uri="http://schemas.openxmlformats.org/drawingml/2006/picture">
+                <pic:pic>
+                  <pic:nvPicPr>
+                    <pic:cNvPr id="0" name="cover - 5Passos.png"/>
+                    <pic:cNvPicPr/>
+                  </pic:nvPicPr>
+                  <pic:blipFill>
+                    <a:blip r:embed="rId9"/>
+                    <a:stretch>
+                      <a:fillRect/>
+                    </a:stretch>
+                  </pic:blipFill>
+                  <pic:spPr>
+                    <a:xfrm>
+                      <a:off x="0" y="0"/>
+                      <a:ext cx="5760720" cy="8641080"/>
+                    </a:xfrm>
+                    <a:prstGeom prst="rect"/>
+                  </pic:spPr>
+                </pic:pic>
+              </a:graphicData>
+            </a:graphic>
+          </wp:inline>
+        </w:drawing>
       </w:r>
     </w:p>
     <w:p>
@@ -262,22 +198,7 @@
           <w:color w:val="1A2942"/>
           <w:sz w:val="23"/>
         </w:rPr>
-        <w:t>Eu sei o que é trabalhar duro —</w:t>
-      </w:r>
-    </w:p>
-    <w:p>
-      <w:pPr>
-        <w:spacing w:before="40" w:after="60" w:line="360" w:lineRule="auto"/>
-      </w:pPr>
-      <w:r>
-        <w:rPr>
-          <w:rFonts w:ascii="Inter" w:hAnsi="Inter"/>
-          <w:b w:val="0"/>
-          <w:i w:val="0"/>
-          <w:color w:val="1A2942"/>
-          <w:sz w:val="23"/>
-        </w:rPr>
-        <w:t>e sentir que não está saindo do lugar.</w:t>
+        <w:t>Eu sei o que é trabalhar duro e não sair do lugar.</w:t>
       </w:r>
     </w:p>
     <w:p>
@@ -402,7 +323,7 @@
           <w:color w:val="1A2942"/>
           <w:sz w:val="23"/>
         </w:rPr>
-        <w:t>coloque em prática.</w:t>
+        <w:t>bota em prática.</w:t>
       </w:r>
     </w:p>
     <w:p>
@@ -521,8 +442,13 @@
           <w:color w:val="1A2942"/>
           <w:sz w:val="23"/>
         </w:rPr>
-        <w:t>Este guia tem 7 passos.</w:t>
-      </w:r>
+        <w:t>Este guia tem 5 passos essenciais.</w:t>
+      </w:r>
+    </w:p>
+    <w:p>
+      <w:pPr>
+        <w:spacing w:before="0" w:after="160"/>
+      </w:pPr>
     </w:p>
     <w:p>
       <w:pPr>
@@ -536,12 +462,12 @@
           <w:color w:val="1A2942"/>
           <w:sz w:val="23"/>
         </w:rPr>
-        <w:t>Eles seguem uma sequência — mas você não precisa começar do início.</w:t>
-      </w:r>
-    </w:p>
-    <w:p>
-      <w:pPr>
-        <w:spacing w:before="0" w:after="160"/>
+        <w:t>Eles seguem uma sequência, mas você não precisa começar do início.</w:t>
+      </w:r>
+    </w:p>
+    <w:p>
+      <w:pPr>
+        <w:spacing w:before="0" w:after="200"/>
       </w:pPr>
     </w:p>
     <w:p>
@@ -591,7 +517,7 @@
     </w:p>
     <w:p>
       <w:pPr>
-        <w:spacing w:before="0" w:after="200"/>
+        <w:spacing w:before="0" w:after="240"/>
       </w:pPr>
     </w:p>
     <w:p>
@@ -606,7 +532,57 @@
           <w:color w:val="0F1B2D"/>
           <w:sz w:val="23"/>
         </w:rPr>
-        <w:t>Encontre onde você está. Comece por aí.</w:t>
+        <w:t>Encontre onde você está.</w:t>
+      </w:r>
+    </w:p>
+    <w:p>
+      <w:pPr>
+        <w:spacing w:before="120" w:after="160" w:line="360" w:lineRule="auto"/>
+      </w:pPr>
+      <w:r>
+        <w:rPr>
+          <w:rFonts w:ascii="Inter" w:hAnsi="Inter"/>
+          <w:b/>
+          <w:i w:val="0"/>
+          <w:color w:val="0F1B2D"/>
+          <w:sz w:val="23"/>
+        </w:rPr>
+        <w:t>Comece por aí.</w:t>
+      </w:r>
+    </w:p>
+    <w:p>
+      <w:pPr>
+        <w:spacing w:before="0" w:after="240"/>
+      </w:pPr>
+    </w:p>
+    <w:p>
+      <w:pPr>
+        <w:spacing w:before="120" w:after="160" w:line="360" w:lineRule="auto"/>
+      </w:pPr>
+      <w:r>
+        <w:rPr>
+          <w:rFonts w:ascii="Inter" w:hAnsi="Inter"/>
+          <w:b w:val="0"/>
+          <w:i w:val="0"/>
+          <w:color w:val="1A2942"/>
+          <w:sz w:val="23"/>
+        </w:rPr>
+        <w:t>Depois da base, vêm as próximas fases:</w:t>
+      </w:r>
+    </w:p>
+    <w:p>
+      <w:pPr>
+        <w:spacing w:before="120" w:after="160" w:line="360" w:lineRule="auto"/>
+      </w:pPr>
+      <w:r>
+        <w:rPr>
+          <w:rFonts w:ascii="Inter" w:hAnsi="Inter"/>
+          <w:b w:val="0"/>
+          <w:i/>
+          <w:color w:val="5B6E8A"/>
+          <w:sz w:val="23"/>
+        </w:rPr>
+        <w:t>aumentar sua renda e construir algo que dure.</w:t>
       </w:r>
     </w:p>
     <w:p>
@@ -765,60 +741,6 @@
       </w:r>
     </w:p>
     <w:p>
-      <w:pPr>
-        <w:spacing w:before="100" w:after="100"/>
-        <w:ind w:left="288"/>
-        <w:shd w:val="clear" w:color="auto" w:fill="F6F1E9"/>
-      </w:pPr>
-      <w:r>
-        <w:rPr>
-          <w:rFonts w:ascii="Montserrat" w:hAnsi="Montserrat"/>
-          <w:b/>
-          <w:i w:val="0"/>
-          <w:color w:val="C8952E"/>
-          <w:sz w:val="24"/>
-        </w:rPr>
-        <w:t xml:space="preserve">06  </w:t>
-      </w:r>
-      <w:r>
-        <w:rPr>
-          <w:rFonts w:ascii="Inter" w:hAnsi="Inter"/>
-          <w:b w:val="0"/>
-          <w:i w:val="0"/>
-          <w:color w:val="0F1B2D"/>
-          <w:sz w:val="24"/>
-        </w:rPr>
-        <w:t>Aumente Sua Renda</w:t>
-      </w:r>
-    </w:p>
-    <w:p>
-      <w:pPr>
-        <w:spacing w:before="100" w:after="100"/>
-        <w:ind w:left="288"/>
-        <w:shd w:val="clear" w:color="auto" w:fill="F6F1E9"/>
-      </w:pPr>
-      <w:r>
-        <w:rPr>
-          <w:rFonts w:ascii="Montserrat" w:hAnsi="Montserrat"/>
-          <w:b/>
-          <w:i w:val="0"/>
-          <w:color w:val="C8952E"/>
-          <w:sz w:val="24"/>
-        </w:rPr>
-        <w:t xml:space="preserve">07  </w:t>
-      </w:r>
-      <w:r>
-        <w:rPr>
-          <w:rFonts w:ascii="Inter" w:hAnsi="Inter"/>
-          <w:b w:val="0"/>
-          <w:i w:val="0"/>
-          <w:color w:val="0F1B2D"/>
-          <w:sz w:val="24"/>
-        </w:rPr>
-        <w:t>Construa Algo que Dure</w:t>
-      </w:r>
-    </w:p>
-    <w:p>
       <w:r>
         <w:br w:type="page"/>
       </w:r>
@@ -1557,7 +1479,7 @@
           <w:color w:val="1A2942"/>
           <w:sz w:val="23"/>
         </w:rPr>
-        <w:t>Você chega sabendo que precisa de algo pra começar.</w:t>
+        <w:t>Você sabe que precisa de um número pra começar.</w:t>
       </w:r>
     </w:p>
     <w:p>
@@ -1572,7 +1494,7 @@
           <w:color w:val="1A2942"/>
           <w:sz w:val="23"/>
         </w:rPr>
-        <w:t>Mas sem saber exatamente o que é — ou o que ele abre.</w:t>
+        <w:t>Só não sabe ao certo o que cada um te abre.</w:t>
       </w:r>
     </w:p>
     <w:p>
@@ -1971,7 +1893,7 @@
           <w:color w:val="1A2942"/>
           <w:sz w:val="23"/>
         </w:rPr>
-        <w:t>Certifique-se de saber o que ele te dá e não te dá acesso.</w:t>
+        <w:t>Entenda o que ele abre — e o que não abre.</w:t>
       </w:r>
     </w:p>
     <w:p>
@@ -3095,7 +3017,22 @@
           <w:color w:val="1A2942"/>
           <w:sz w:val="23"/>
         </w:rPr>
-        <w:t>O que dá pra fazer é evitar os erros que te obrigam a recomeçar — e dar os passos certos cedo o suficiente pra que o tempo trabalhe a seu favor.</w:t>
+        <w:t>O que dá pra fazer: evitar os erros que te obrigam a recomeçar.</w:t>
+      </w:r>
+    </w:p>
+    <w:p>
+      <w:pPr>
+        <w:spacing w:before="120" w:after="160" w:line="360" w:lineRule="auto"/>
+      </w:pPr>
+      <w:r>
+        <w:rPr>
+          <w:rFonts w:ascii="Inter" w:hAnsi="Inter"/>
+          <w:b w:val="0"/>
+          <w:i w:val="0"/>
+          <w:color w:val="1A2942"/>
+          <w:sz w:val="23"/>
+        </w:rPr>
+        <w:t>E dar os passos certos cedo o suficiente pra que o tempo trabalhe a seu favor.</w:t>
       </w:r>
     </w:p>
     <w:p>
@@ -3777,6 +3714,46 @@
           <w:sz w:val="26"/>
         </w:rPr>
         <w:t>Como o risco realmente parece</w:t>
+      </w:r>
+    </w:p>
+    <w:p>
+      <w:pPr>
+        <w:spacing w:before="160" w:after="200"/>
+        <w:jc w:val="center"/>
+      </w:pPr>
+      <w:r>
+        <w:drawing>
+          <wp:inline xmlns:a="http://schemas.openxmlformats.org/drawingml/2006/main" xmlns:pic="http://schemas.openxmlformats.org/drawingml/2006/picture">
+            <wp:extent cx="3840480" cy="2560320"/>
+            <wp:docPr id="2" name="Picture 2"/>
+            <wp:cNvGraphicFramePr>
+              <a:graphicFrameLocks noChangeAspect="1"/>
+            </wp:cNvGraphicFramePr>
+            <a:graphic>
+              <a:graphicData uri="http://schemas.openxmlformats.org/drawingml/2006/picture">
+                <pic:pic>
+                  <pic:nvPicPr>
+                    <pic:cNvPr id="0" name="Step 5 Protection subtle family.png"/>
+                    <pic:cNvPicPr/>
+                  </pic:nvPicPr>
+                  <pic:blipFill>
+                    <a:blip r:embed="rId10"/>
+                    <a:stretch>
+                      <a:fillRect/>
+                    </a:stretch>
+                  </pic:blipFill>
+                  <pic:spPr>
+                    <a:xfrm>
+                      <a:off x="0" y="0"/>
+                      <a:ext cx="3840480" cy="2560320"/>
+                    </a:xfrm>
+                    <a:prstGeom prst="rect"/>
+                  </pic:spPr>
+                </pic:pic>
+              </a:graphicData>
+            </a:graphic>
+          </wp:inline>
+        </w:drawing>
       </w:r>
     </w:p>
     <w:p>
@@ -4122,7 +4099,7 @@
           <w:color w:val="1A2942"/>
           <w:sz w:val="22"/>
         </w:rPr>
-        <w:t>Não existe estável. Estabilidade se constrói, não se espera. Quem espera a hora certa costuma esperar demais.</w:t>
+        <w:t>Não existe estável. Estabilidade se constrói, não se espera. Quem espera o momento perfeito, espera para sempre.</w:t>
       </w:r>
     </w:p>
     <w:p>
@@ -4366,6 +4343,454 @@
       </w:r>
     </w:p>
     <w:p>
+      <w:pPr>
+        <w:spacing w:before="0" w:after="440"/>
+      </w:pPr>
+    </w:p>
+    <w:p>
+      <w:pPr>
+        <w:spacing w:before="120" w:after="160" w:line="360" w:lineRule="auto"/>
+      </w:pPr>
+      <w:r>
+        <w:rPr>
+          <w:rFonts w:ascii="Inter" w:hAnsi="Inter"/>
+          <w:b/>
+          <w:i w:val="0"/>
+          <w:color w:val="0F1B2D"/>
+          <w:sz w:val="23"/>
+        </w:rPr>
+        <w:t>Até aqui, você organizou a base.</w:t>
+      </w:r>
+    </w:p>
+    <w:p>
+      <w:pPr>
+        <w:spacing w:before="0" w:after="200"/>
+      </w:pPr>
+    </w:p>
+    <w:p>
+      <w:pPr>
+        <w:spacing w:before="120" w:after="160" w:line="360" w:lineRule="auto"/>
+      </w:pPr>
+      <w:r>
+        <w:rPr>
+          <w:rFonts w:ascii="Inter" w:hAnsi="Inter"/>
+          <w:b w:val="0"/>
+          <w:i w:val="0"/>
+          <w:color w:val="1A2942"/>
+          <w:sz w:val="23"/>
+        </w:rPr>
+        <w:t>É aqui que a maioria para.</w:t>
+      </w:r>
+    </w:p>
+    <w:p>
+      <w:pPr>
+        <w:spacing w:before="0" w:after="240"/>
+      </w:pPr>
+    </w:p>
+    <w:p>
+      <w:pPr>
+        <w:spacing w:before="120" w:after="160" w:line="360" w:lineRule="auto"/>
+      </w:pPr>
+      <w:r>
+        <w:rPr>
+          <w:rFonts w:ascii="Inter" w:hAnsi="Inter"/>
+          <w:b w:val="0"/>
+          <w:i w:val="0"/>
+          <w:color w:val="1A2942"/>
+          <w:sz w:val="23"/>
+        </w:rPr>
+        <w:t>Mas quem realmente avança entende duas coisas:</w:t>
+      </w:r>
+    </w:p>
+    <w:p>
+      <w:pPr>
+        <w:spacing w:before="0" w:after="200"/>
+      </w:pPr>
+    </w:p>
+    <w:p>
+      <w:pPr>
+        <w:spacing w:before="120" w:after="160" w:line="360" w:lineRule="auto"/>
+      </w:pPr>
+      <w:r>
+        <w:rPr>
+          <w:rFonts w:ascii="Inter" w:hAnsi="Inter"/>
+          <w:b w:val="0"/>
+          <w:i w:val="0"/>
+          <w:color w:val="1A2942"/>
+          <w:sz w:val="23"/>
+        </w:rPr>
+        <w:t>Como aumentar a renda…</w:t>
+      </w:r>
+    </w:p>
+    <w:p>
+      <w:pPr>
+        <w:spacing w:before="120" w:after="160" w:line="360" w:lineRule="auto"/>
+      </w:pPr>
+      <w:r>
+        <w:rPr>
+          <w:rFonts w:ascii="Inter" w:hAnsi="Inter"/>
+          <w:b w:val="0"/>
+          <w:i w:val="0"/>
+          <w:color w:val="1A2942"/>
+          <w:sz w:val="23"/>
+        </w:rPr>
+        <w:t>E como construir algo que não dependa só do seu tempo.</w:t>
+      </w:r>
+    </w:p>
+    <w:p>
+      <w:pPr>
+        <w:spacing w:before="0" w:after="240"/>
+      </w:pPr>
+    </w:p>
+    <w:p>
+      <w:pPr>
+        <w:spacing w:before="120" w:after="160" w:line="360" w:lineRule="auto"/>
+      </w:pPr>
+      <w:r>
+        <w:rPr>
+          <w:rFonts w:ascii="Inter" w:hAnsi="Inter"/>
+          <w:b w:val="0"/>
+          <w:i w:val="0"/>
+          <w:color w:val="1A2942"/>
+          <w:sz w:val="23"/>
+        </w:rPr>
+        <w:t>Essas são as próximas fases.</w:t>
+      </w:r>
+    </w:p>
+    <w:p>
+      <w:pPr>
+        <w:spacing w:before="0" w:after="200"/>
+      </w:pPr>
+    </w:p>
+    <w:p>
+      <w:pPr>
+        <w:spacing w:before="120" w:after="160" w:line="360" w:lineRule="auto"/>
+      </w:pPr>
+      <w:r>
+        <w:rPr>
+          <w:rFonts w:ascii="Inter" w:hAnsi="Inter"/>
+          <w:b/>
+          <w:i w:val="0"/>
+          <w:color w:val="0F1B2D"/>
+          <w:sz w:val="23"/>
+        </w:rPr>
+        <w:t>Mas elas só funcionam quando a base está certa.</w:t>
+      </w:r>
+    </w:p>
+    <w:p>
+      <w:r>
+        <w:br w:type="page"/>
+      </w:r>
+    </w:p>
+    <w:p>
+      <w:pPr>
+        <w:spacing w:before="400" w:after="160"/>
+      </w:pPr>
+      <w:r>
+        <w:rPr>
+          <w:rFonts w:ascii="Inter" w:hAnsi="Inter"/>
+          <w:b/>
+          <w:i w:val="0"/>
+          <w:color w:val="0F1B2D"/>
+          <w:sz w:val="40"/>
+        </w:rPr>
+        <w:t>Se você continuar como está…</w:t>
+      </w:r>
+    </w:p>
+    <w:p>
+      <w:pPr>
+        <w:spacing w:before="40" w:after="80"/>
+        <w:pBdr>
+          <w:bottom w:val="single" w:sz="6" w:space="1" w:color="C8952E"/>
+        </w:pBdr>
+      </w:pPr>
+    </w:p>
+    <w:p>
+      <w:pPr>
+        <w:spacing w:before="0" w:after="320"/>
+      </w:pPr>
+    </w:p>
+    <w:p>
+      <w:pPr>
+        <w:spacing w:before="120" w:after="160" w:line="360" w:lineRule="auto"/>
+      </w:pPr>
+      <w:r>
+        <w:rPr>
+          <w:rFonts w:ascii="Inter" w:hAnsi="Inter"/>
+          <w:b w:val="0"/>
+          <w:i w:val="0"/>
+          <w:color w:val="1A2942"/>
+          <w:sz w:val="23"/>
+        </w:rPr>
+        <w:t>Se nada mudar, daqui a 1 ano sua vida vai estar igual.</w:t>
+      </w:r>
+    </w:p>
+    <w:p>
+      <w:pPr>
+        <w:spacing w:before="0" w:after="240"/>
+      </w:pPr>
+    </w:p>
+    <w:p>
+      <w:pPr>
+        <w:spacing w:before="120" w:after="160" w:line="360" w:lineRule="auto"/>
+      </w:pPr>
+      <w:r>
+        <w:rPr>
+          <w:rFonts w:ascii="Inter" w:hAnsi="Inter"/>
+          <w:b w:val="0"/>
+          <w:i w:val="0"/>
+          <w:color w:val="1A2942"/>
+          <w:sz w:val="23"/>
+        </w:rPr>
+        <w:t>Mais trabalho.</w:t>
+      </w:r>
+    </w:p>
+    <w:p>
+      <w:pPr>
+        <w:spacing w:before="120" w:after="160" w:line="360" w:lineRule="auto"/>
+      </w:pPr>
+      <w:r>
+        <w:rPr>
+          <w:rFonts w:ascii="Inter" w:hAnsi="Inter"/>
+          <w:b w:val="0"/>
+          <w:i w:val="0"/>
+          <w:color w:val="1A2942"/>
+          <w:sz w:val="23"/>
+        </w:rPr>
+        <w:t>Mais esforço.</w:t>
+      </w:r>
+    </w:p>
+    <w:p>
+      <w:pPr>
+        <w:spacing w:before="120" w:after="160" w:line="360" w:lineRule="auto"/>
+      </w:pPr>
+      <w:r>
+        <w:rPr>
+          <w:rFonts w:ascii="Inter" w:hAnsi="Inter"/>
+          <w:b w:val="0"/>
+          <w:i w:val="0"/>
+          <w:color w:val="1A2942"/>
+          <w:sz w:val="23"/>
+        </w:rPr>
+        <w:t>E a mesma sensação de que algo está faltando.</w:t>
+      </w:r>
+    </w:p>
+    <w:p>
+      <w:pPr>
+        <w:spacing w:before="0" w:after="360"/>
+      </w:pPr>
+    </w:p>
+    <w:p>
+      <w:pPr>
+        <w:spacing w:before="120" w:after="160" w:line="360" w:lineRule="auto"/>
+      </w:pPr>
+      <w:r>
+        <w:rPr>
+          <w:rFonts w:ascii="Inter" w:hAnsi="Inter"/>
+          <w:b w:val="0"/>
+          <w:i w:val="0"/>
+          <w:color w:val="1A2942"/>
+          <w:sz w:val="23"/>
+        </w:rPr>
+        <w:t>Não é porque você não tenta.</w:t>
+      </w:r>
+    </w:p>
+    <w:p>
+      <w:pPr>
+        <w:spacing w:before="0" w:after="240"/>
+      </w:pPr>
+    </w:p>
+    <w:p>
+      <w:pPr>
+        <w:spacing w:before="120" w:after="160" w:line="360" w:lineRule="auto"/>
+      </w:pPr>
+      <w:r>
+        <w:rPr>
+          <w:rFonts w:ascii="Inter" w:hAnsi="Inter"/>
+          <w:b w:val="0"/>
+          <w:i w:val="0"/>
+          <w:color w:val="1A2942"/>
+          <w:sz w:val="23"/>
+        </w:rPr>
+        <w:t>É porque ninguém te mostrou a ordem certa.</w:t>
+      </w:r>
+    </w:p>
+    <w:p>
+      <w:pPr>
+        <w:spacing w:before="0" w:after="360"/>
+      </w:pPr>
+    </w:p>
+    <w:p>
+      <w:pPr>
+        <w:spacing w:before="120" w:after="160" w:line="360" w:lineRule="auto"/>
+      </w:pPr>
+      <w:r>
+        <w:rPr>
+          <w:rFonts w:ascii="Inter" w:hAnsi="Inter"/>
+          <w:b w:val="0"/>
+          <w:i w:val="0"/>
+          <w:color w:val="1A2942"/>
+          <w:sz w:val="23"/>
+        </w:rPr>
+        <w:t>E esse é o ponto que a maioria das pessoas trava.</w:t>
+      </w:r>
+    </w:p>
+    <w:p>
+      <w:pPr>
+        <w:spacing w:before="0" w:after="240"/>
+      </w:pPr>
+    </w:p>
+    <w:p>
+      <w:pPr>
+        <w:spacing w:before="120" w:after="160" w:line="360" w:lineRule="auto"/>
+      </w:pPr>
+      <w:r>
+        <w:rPr>
+          <w:rFonts w:ascii="Inter" w:hAnsi="Inter"/>
+          <w:b w:val="0"/>
+          <w:i w:val="0"/>
+          <w:color w:val="1A2942"/>
+          <w:sz w:val="23"/>
+        </w:rPr>
+        <w:t>Elas entendem.</w:t>
+      </w:r>
+    </w:p>
+    <w:p>
+      <w:pPr>
+        <w:spacing w:before="0" w:after="80"/>
+      </w:pPr>
+    </w:p>
+    <w:p>
+      <w:pPr>
+        <w:spacing w:before="120" w:after="160" w:line="360" w:lineRule="auto"/>
+      </w:pPr>
+      <w:r>
+        <w:rPr>
+          <w:rFonts w:ascii="Inter" w:hAnsi="Inter"/>
+          <w:b w:val="0"/>
+          <w:i w:val="0"/>
+          <w:color w:val="1A2942"/>
+          <w:sz w:val="23"/>
+        </w:rPr>
+        <w:t>Mas não fazem nada com isso.</w:t>
+      </w:r>
+    </w:p>
+    <w:p>
+      <w:pPr>
+        <w:spacing w:before="0" w:after="440"/>
+      </w:pPr>
+    </w:p>
+    <w:p>
+      <w:pPr>
+        <w:spacing w:before="120" w:after="160" w:line="360" w:lineRule="auto"/>
+      </w:pPr>
+      <w:r>
+        <w:rPr>
+          <w:rFonts w:ascii="Inter" w:hAnsi="Inter"/>
+          <w:b/>
+          <w:i w:val="0"/>
+          <w:color w:val="0F1B2D"/>
+          <w:sz w:val="26"/>
+        </w:rPr>
+        <w:t>Você tem duas opções agora:</w:t>
+      </w:r>
+    </w:p>
+    <w:p>
+      <w:pPr>
+        <w:spacing w:before="0" w:after="320"/>
+      </w:pPr>
+    </w:p>
+    <w:p>
+      <w:pPr>
+        <w:spacing w:before="120" w:after="160" w:line="360" w:lineRule="auto"/>
+      </w:pPr>
+      <w:r>
+        <w:rPr>
+          <w:rFonts w:ascii="Inter" w:hAnsi="Inter"/>
+          <w:b w:val="0"/>
+          <w:i w:val="0"/>
+          <w:color w:val="1A2942"/>
+          <w:sz w:val="23"/>
+        </w:rPr>
+        <w:t>Fechar esse guia… e continuar exatamente onde você está hoje.</w:t>
+      </w:r>
+    </w:p>
+    <w:p>
+      <w:pPr>
+        <w:spacing w:before="0" w:after="240"/>
+      </w:pPr>
+    </w:p>
+    <w:p>
+      <w:pPr>
+        <w:spacing w:before="120" w:after="160" w:line="360" w:lineRule="auto"/>
+      </w:pPr>
+      <w:r>
+        <w:rPr>
+          <w:rFonts w:ascii="Inter" w:hAnsi="Inter"/>
+          <w:b/>
+          <w:i w:val="0"/>
+          <w:color w:val="0F1B2D"/>
+          <w:sz w:val="23"/>
+        </w:rPr>
+        <w:t>Ou usar isso como ponto de virada.</w:t>
+      </w:r>
+    </w:p>
+    <w:p>
+      <w:pPr>
+        <w:spacing w:before="0" w:after="440"/>
+      </w:pPr>
+    </w:p>
+    <w:p>
+      <w:pPr>
+        <w:spacing w:before="120" w:after="160" w:line="360" w:lineRule="auto"/>
+      </w:pPr>
+      <w:r>
+        <w:rPr>
+          <w:rFonts w:ascii="Inter" w:hAnsi="Inter"/>
+          <w:b w:val="0"/>
+          <w:i w:val="0"/>
+          <w:color w:val="1A2942"/>
+          <w:sz w:val="23"/>
+        </w:rPr>
+        <w:t>Você não precisa resolver tudo hoje.</w:t>
+      </w:r>
+    </w:p>
+    <w:p>
+      <w:pPr>
+        <w:spacing w:before="0" w:after="240"/>
+      </w:pPr>
+    </w:p>
+    <w:p>
+      <w:pPr>
+        <w:spacing w:before="120" w:after="40" w:line="360" w:lineRule="auto"/>
+      </w:pPr>
+      <w:r>
+        <w:rPr>
+          <w:rFonts w:ascii="Inter" w:hAnsi="Inter"/>
+          <w:b w:val="0"/>
+          <w:i w:val="0"/>
+          <w:color w:val="1A2942"/>
+          <w:sz w:val="23"/>
+        </w:rPr>
+        <w:t>Mas precisa decidir se vai continuar no mesmo caminho —</w:t>
+      </w:r>
+    </w:p>
+    <w:p>
+      <w:pPr>
+        <w:spacing w:before="0" w:after="160" w:line="360" w:lineRule="auto"/>
+      </w:pPr>
+      <w:r>
+        <w:rPr>
+          <w:rFonts w:ascii="Inter" w:hAnsi="Inter"/>
+          <w:b w:val="0"/>
+          <w:i w:val="0"/>
+          <w:color w:val="1A2942"/>
+          <w:sz w:val="23"/>
+        </w:rPr>
+        <w:t>ou começar a ajustar isso de forma intencional.</w:t>
+      </w:r>
+    </w:p>
+    <w:p>
       <w:r>
         <w:br w:type="page"/>
       </w:r>
@@ -4388,9 +4813,7 @@
           <w:color w:val="0F1B2D"/>
           <w:sz w:val="44"/>
         </w:rPr>
-        <w:t>Precisa de ajuda pra aplicar</w:t>
-        <w:br/>
-        <w:t>isso na sua situação?</w:t>
+        <w:t>Quer conversar sobre a sua situação?</w:t>
       </w:r>
     </w:p>
     <w:p>
@@ -4403,27 +4826,12 @@
     </w:p>
     <w:p>
       <w:pPr>
-        <w:spacing w:before="0" w:after="400"/>
-      </w:pPr>
-    </w:p>
-    <w:p>
-      <w:pPr>
-        <w:spacing w:before="120" w:after="240" w:line="360" w:lineRule="auto"/>
-      </w:pPr>
-      <w:r>
-        <w:rPr>
-          <w:rFonts w:ascii="Inter" w:hAnsi="Inter"/>
-          <w:b/>
-          <w:i w:val="0"/>
-          <w:color w:val="0F1B2D"/>
-          <w:sz w:val="26"/>
-        </w:rPr>
-        <w:t>Você não precisa fazer isso sozinho.</w:t>
-      </w:r>
-    </w:p>
-    <w:p>
-      <w:pPr>
-        <w:spacing w:before="120" w:after="80"/>
+        <w:spacing w:before="0" w:after="480"/>
+      </w:pPr>
+    </w:p>
+    <w:p>
+      <w:pPr>
+        <w:spacing w:before="80" w:after="80"/>
         <w:jc w:val="center"/>
       </w:pPr>
       <w:r>
@@ -4432,14 +4840,19 @@
           <w:b w:val="0"/>
           <w:i w:val="0"/>
           <w:color w:val="1A2942"/>
-          <w:sz w:val="24"/>
+          <w:sz w:val="26"/>
         </w:rPr>
-        <w:t>Se quiser clareza sobre o seu caso específico,</w:t>
-      </w:r>
-    </w:p>
-    <w:p>
-      <w:pPr>
-        <w:spacing w:before="0" w:after="120"/>
+        <w:t>Se esse guia fez sentido pra você, não para aqui.</w:t>
+      </w:r>
+    </w:p>
+    <w:p>
+      <w:pPr>
+        <w:spacing w:before="0" w:after="160"/>
+      </w:pPr>
+    </w:p>
+    <w:p>
+      <w:pPr>
+        <w:spacing w:before="80" w:after="80"/>
         <w:jc w:val="center"/>
       </w:pPr>
       <w:r>
@@ -4448,9 +4861,136 @@
           <w:b w:val="0"/>
           <w:i w:val="0"/>
           <w:color w:val="1A2942"/>
-          <w:sz w:val="24"/>
+          <w:sz w:val="26"/>
         </w:rPr>
-        <w:t>fale com a gente direto no WhatsApp.</w:t>
+        <w:t>A maioria das pessoas entende isso…</w:t>
+      </w:r>
+    </w:p>
+    <w:p>
+      <w:pPr>
+        <w:spacing w:before="80" w:after="80"/>
+        <w:jc w:val="center"/>
+      </w:pPr>
+      <w:r>
+        <w:rPr>
+          <w:rFonts w:ascii="Inter" w:hAnsi="Inter"/>
+          <w:b w:val="0"/>
+          <w:i w:val="0"/>
+          <w:color w:val="1A2942"/>
+          <w:sz w:val="26"/>
+        </w:rPr>
+        <w:t>e não faz nada.</w:t>
+      </w:r>
+    </w:p>
+    <w:p>
+      <w:pPr>
+        <w:spacing w:before="0" w:after="160"/>
+      </w:pPr>
+    </w:p>
+    <w:p>
+      <w:pPr>
+        <w:spacing w:before="80" w:after="80"/>
+        <w:jc w:val="center"/>
+      </w:pPr>
+      <w:r>
+        <w:rPr>
+          <w:rFonts w:ascii="Inter" w:hAnsi="Inter"/>
+          <w:b w:val="0"/>
+          <w:i w:val="0"/>
+          <w:color w:val="1A2942"/>
+          <w:sz w:val="26"/>
+        </w:rPr>
+        <w:t>Se você quiser clareza sobre a sua situação,</w:t>
+      </w:r>
+    </w:p>
+    <w:p>
+      <w:pPr>
+        <w:spacing w:before="80" w:after="80"/>
+        <w:jc w:val="center"/>
+      </w:pPr>
+      <w:r>
+        <w:rPr>
+          <w:rFonts w:ascii="Inter" w:hAnsi="Inter"/>
+          <w:b w:val="0"/>
+          <w:i w:val="0"/>
+          <w:color w:val="1A2942"/>
+          <w:sz w:val="26"/>
+        </w:rPr>
+        <w:t>manda uma mensagem no WhatsApp e me fala onde você está hoje.</w:t>
+      </w:r>
+    </w:p>
+    <w:p>
+      <w:pPr>
+        <w:spacing w:before="0" w:after="160"/>
+      </w:pPr>
+    </w:p>
+    <w:p>
+      <w:pPr>
+        <w:spacing w:before="80" w:after="80"/>
+        <w:jc w:val="center"/>
+      </w:pPr>
+      <w:r>
+        <w:rPr>
+          <w:rFonts w:ascii="Inter" w:hAnsi="Inter"/>
+          <w:b w:val="0"/>
+          <w:i w:val="0"/>
+          <w:color w:val="1A2942"/>
+          <w:sz w:val="26"/>
+        </w:rPr>
+        <w:t>A gente olha junto.</w:t>
+      </w:r>
+    </w:p>
+    <w:p>
+      <w:pPr>
+        <w:spacing w:before="0" w:after="160"/>
+      </w:pPr>
+    </w:p>
+    <w:p>
+      <w:pPr>
+        <w:spacing w:before="80" w:after="80"/>
+        <w:jc w:val="center"/>
+      </w:pPr>
+      <w:r>
+        <w:rPr>
+          <w:rFonts w:ascii="Inter" w:hAnsi="Inter"/>
+          <w:b w:val="0"/>
+          <w:i w:val="0"/>
+          <w:color w:val="1A2942"/>
+          <w:sz w:val="26"/>
+        </w:rPr>
+        <w:t>Sem pressão.</w:t>
+      </w:r>
+    </w:p>
+    <w:p>
+      <w:pPr>
+        <w:spacing w:before="80" w:after="80"/>
+        <w:jc w:val="center"/>
+      </w:pPr>
+      <w:r>
+        <w:rPr>
+          <w:rFonts w:ascii="Inter" w:hAnsi="Inter"/>
+          <w:b w:val="0"/>
+          <w:i w:val="0"/>
+          <w:color w:val="1A2942"/>
+          <w:sz w:val="26"/>
+        </w:rPr>
+        <w:t>Sem promessa.</w:t>
+      </w:r>
+    </w:p>
+    <w:p>
+      <w:pPr>
+        <w:spacing w:before="80" w:after="80"/>
+        <w:jc w:val="center"/>
+      </w:pPr>
+      <w:r>
+        <w:rPr>
+          <w:rFonts w:ascii="Inter" w:hAnsi="Inter"/>
+          <w:b w:val="0"/>
+          <w:i w:val="0"/>
+          <w:color w:val="1A2942"/>
+          <w:sz w:val="26"/>
+        </w:rPr>
+        <w:t>Só direção.</w:t>
       </w:r>
     </w:p>
     <w:p>
@@ -4472,7 +5012,7 @@
           <w:color w:val="FFFFFF"/>
           <w:sz w:val="28"/>
         </w:rPr>
-        <w:t>Falar no WhatsApp</w:t>
+        <w:t>Quero conversar no WhatsApp →</w:t>
       </w:r>
     </w:p>
     <w:p>
@@ -4494,6 +5034,48 @@
           <w:sz w:val="20"/>
         </w:rPr>
         <w:t>wa.me/13526303930</w:t>
+      </w:r>
+    </w:p>
+    <w:p>
+      <w:pPr>
+        <w:spacing w:before="0" w:after="200"/>
+      </w:pPr>
+    </w:p>
+    <w:p>
+      <w:pPr>
+        <w:spacing w:before="80" w:after="80"/>
+        <w:jc w:val="center"/>
+      </w:pPr>
+      <w:r>
+        <w:rPr>
+          <w:rFonts w:ascii="Inter" w:hAnsi="Inter"/>
+          <w:b w:val="0"/>
+          <w:i/>
+          <w:color w:val="5B6E8A"/>
+          <w:sz w:val="20"/>
+        </w:rPr>
+        <w:t>Se você leu até aqui, você não é a maioria.</w:t>
+      </w:r>
+    </w:p>
+    <w:p>
+      <w:pPr>
+        <w:spacing w:before="0" w:after="400"/>
+      </w:pPr>
+    </w:p>
+    <w:p>
+      <w:pPr>
+        <w:spacing w:before="80" w:after="80"/>
+        <w:jc w:val="center"/>
+      </w:pPr>
+      <w:r>
+        <w:rPr>
+          <w:rFonts w:ascii="Inter" w:hAnsi="Inter"/>
+          <w:b w:val="0"/>
+          <w:i w:val="0"/>
+          <w:color w:val="5B6E8A"/>
+          <w:sz w:val="20"/>
+        </w:rPr>
+        <w:t>prosperinamerica.com  |  @prosperinamerica</w:t>
       </w:r>
     </w:p>
     <w:sectPr>

</xml_diff>

<commit_message>
V2 PDF: new cover, identity callout, couple photo, testimonial placeholders
- Replace cover with NovaCapaGuia5Passos.png in both generators
- Add first-15-seconds identity callout box to Como Usar page (Rule 1)
- Add couple photo and WhatsApp link to Wellen's letter page
- Add couple photo to CTA page
- Add commented testimonial placeholder blocks at 3 positions
- Regenerate PT PDF and DOCX
- Add PIA Conversion Rules and Communication Rules to CLAUDE.md

Co-Authored-By: Claude Sonnet 4.6 <noreply@anthropic.com>
</commit_message>
<xml_diff>
--- a/public/assets/prosper_in_america_guia_pt.docx
+++ b/public/assets/prosper_in_america_guia_pt.docx
@@ -4,42 +4,36 @@
   <w:body>
     <w:p>
       <w:pPr>
-        <w:spacing w:before="0" w:after="0"/>
+        <w:spacing w:before="1600" w:after="160"/>
         <w:jc w:val="center"/>
-      </w:pPr>
-      <w:r>
-        <w:drawing>
-          <wp:inline xmlns:a="http://schemas.openxmlformats.org/drawingml/2006/main" xmlns:pic="http://schemas.openxmlformats.org/drawingml/2006/picture">
-            <wp:extent cx="5760720" cy="8641080"/>
-            <wp:docPr id="1" name="Picture 1"/>
-            <wp:cNvGraphicFramePr>
-              <a:graphicFrameLocks noChangeAspect="1"/>
-            </wp:cNvGraphicFramePr>
-            <a:graphic>
-              <a:graphicData uri="http://schemas.openxmlformats.org/drawingml/2006/picture">
-                <pic:pic>
-                  <pic:nvPicPr>
-                    <pic:cNvPr id="0" name="cover - 5Passos.png"/>
-                    <pic:cNvPicPr/>
-                  </pic:nvPicPr>
-                  <pic:blipFill>
-                    <a:blip r:embed="rId9"/>
-                    <a:stretch>
-                      <a:fillRect/>
-                    </a:stretch>
-                  </pic:blipFill>
-                  <pic:spPr>
-                    <a:xfrm>
-                      <a:off x="0" y="0"/>
-                      <a:ext cx="5760720" cy="8641080"/>
-                    </a:xfrm>
-                    <a:prstGeom prst="rect"/>
-                  </pic:spPr>
-                </pic:pic>
-              </a:graphicData>
-            </a:graphic>
-          </wp:inline>
-        </w:drawing>
+        <w:shd w:val="clear" w:color="auto" w:fill="0F1B2D"/>
+      </w:pPr>
+      <w:r>
+        <w:rPr>
+          <w:rFonts w:ascii="Montserrat" w:hAnsi="Montserrat"/>
+          <w:b/>
+          <w:i w:val="0"/>
+          <w:color w:val="C8952E"/>
+          <w:sz w:val="64"/>
+        </w:rPr>
+        <w:t>PROSPER IN AMERICA</w:t>
+      </w:r>
+    </w:p>
+    <w:p>
+      <w:pPr>
+        <w:spacing w:before="0" w:after="120"/>
+        <w:jc w:val="center"/>
+        <w:shd w:val="clear" w:color="auto" w:fill="0F1B2D"/>
+      </w:pPr>
+      <w:r>
+        <w:rPr>
+          <w:rFonts w:ascii="Inter" w:hAnsi="Inter"/>
+          <w:b w:val="0"/>
+          <w:i w:val="0"/>
+          <w:color w:val="F6F1E9"/>
+          <w:sz w:val="32"/>
+        </w:rPr>
+        <w:t>O Guia Inicial do Imigrante Brasileiro</w:t>
       </w:r>
     </w:p>
     <w:p>
@@ -397,6 +391,27 @@
       </w:r>
     </w:p>
     <w:p>
+      <w:pPr>
+        <w:spacing w:before="0" w:after="240"/>
+      </w:pPr>
+    </w:p>
+    <w:p>
+      <w:pPr>
+        <w:spacing w:before="80" w:after="280"/>
+        <w:jc w:val="center"/>
+      </w:pPr>
+      <w:r>
+        <w:rPr>
+          <w:rFonts w:ascii="Inter" w:hAnsi="Inter"/>
+          <w:b w:val="0"/>
+          <w:i/>
+          <w:color w:val="5B6E8A"/>
+          <w:sz w:val="20"/>
+        </w:rPr>
+        <w:t>wa.me/13526303930</w:t>
+      </w:r>
+    </w:p>
+    <w:p>
       <w:r>
         <w:br w:type="page"/>
       </w:r>
@@ -592,6 +607,47 @@
     </w:p>
     <w:p>
       <w:pPr>
+        <w:spacing w:before="240" w:after="240"/>
+        <w:ind w:left="216"/>
+        <w:shd w:val="clear" w:color="auto" w:fill="F6F1E9"/>
+        <w:pBdr>
+          <w:left w:val="single" w:sz="36" w:space="4" w:color="C8952E"/>
+        </w:pBdr>
+      </w:pPr>
+      <w:r>
+        <w:rPr>
+          <w:rFonts w:ascii="Inter" w:hAnsi="Inter"/>
+          <w:b/>
+          <w:i w:val="0"/>
+          <w:color w:val="0F1B2D"/>
+          <w:sz w:val="23"/>
+        </w:rPr>
+        <w:t>Prosper In America é um serviço de consultoria para imigrantes brasileiros nos EUA. A gente ajuda famílias a organizar a base financeira, proteger o que estão construindo, e criar caminhos para aumentar a renda. Este guia é gratuito. Se quiser ajuda pra aplicar o que está aqui, a conversa começa no WhatsApp. Sem compromisso.</w:t>
+      </w:r>
+    </w:p>
+    <w:p>
+      <w:pPr>
+        <w:spacing w:before="0" w:after="160"/>
+      </w:pPr>
+    </w:p>
+    <w:p>
+      <w:pPr>
+        <w:spacing w:before="0" w:after="280"/>
+        <w:jc w:val="center"/>
+      </w:pPr>
+      <w:r>
+        <w:rPr>
+          <w:rFonts w:ascii="Inter" w:hAnsi="Inter"/>
+          <w:b w:val="0"/>
+          <w:i/>
+          <w:color w:val="5B6E8A"/>
+          <w:sz w:val="20"/>
+        </w:rPr>
+        <w:t>wa.me/13526303930</w:t>
+      </w:r>
+    </w:p>
+    <w:p>
+      <w:pPr>
         <w:spacing w:before="400" w:after="160"/>
       </w:pPr>
       <w:r>
@@ -3714,46 +3770,6 @@
           <w:sz w:val="26"/>
         </w:rPr>
         <w:t>Como o risco realmente parece</w:t>
-      </w:r>
-    </w:p>
-    <w:p>
-      <w:pPr>
-        <w:spacing w:before="160" w:after="200"/>
-        <w:jc w:val="center"/>
-      </w:pPr>
-      <w:r>
-        <w:drawing>
-          <wp:inline xmlns:a="http://schemas.openxmlformats.org/drawingml/2006/main" xmlns:pic="http://schemas.openxmlformats.org/drawingml/2006/picture">
-            <wp:extent cx="3840480" cy="2560320"/>
-            <wp:docPr id="2" name="Picture 2"/>
-            <wp:cNvGraphicFramePr>
-              <a:graphicFrameLocks noChangeAspect="1"/>
-            </wp:cNvGraphicFramePr>
-            <a:graphic>
-              <a:graphicData uri="http://schemas.openxmlformats.org/drawingml/2006/picture">
-                <pic:pic>
-                  <pic:nvPicPr>
-                    <pic:cNvPr id="0" name="Step 5 Protection subtle family.png"/>
-                    <pic:cNvPicPr/>
-                  </pic:nvPicPr>
-                  <pic:blipFill>
-                    <a:blip r:embed="rId10"/>
-                    <a:stretch>
-                      <a:fillRect/>
-                    </a:stretch>
-                  </pic:blipFill>
-                  <pic:spPr>
-                    <a:xfrm>
-                      <a:off x="0" y="0"/>
-                      <a:ext cx="3840480" cy="2560320"/>
-                    </a:xfrm>
-                    <a:prstGeom prst="rect"/>
-                  </pic:spPr>
-                </pic:pic>
-              </a:graphicData>
-            </a:graphic>
-          </wp:inline>
-        </w:drawing>
       </w:r>
     </w:p>
     <w:p>
@@ -4995,7 +5011,12 @@
     </w:p>
     <w:p>
       <w:pPr>
-        <w:spacing w:before="0" w:after="640"/>
+        <w:spacing w:before="0" w:after="320"/>
+      </w:pPr>
+    </w:p>
+    <w:p>
+      <w:pPr>
+        <w:spacing w:before="0" w:after="320"/>
       </w:pPr>
     </w:p>
     <w:p>

</xml_diff>